<commit_message>
Informe, ahora si final.
No se habia añadido el nombre del otro compañero
</commit_message>
<xml_diff>
--- a/Desafio I/INFORME FINAL DESAFIO I.docx
+++ b/Desafio I/INFORME FINAL DESAFIO I.docx
@@ -199,6 +199,14 @@
           <w:lang w:val="es-MX"/>
         </w:rPr>
       </w:pPr>
+      <w:r>
+        <w:rPr>
+          <w:rFonts w:ascii="Times New Roman" w:hAnsi="Times New Roman" w:cs="Times New Roman"/>
+          <w:sz w:val="24"/>
+          <w:lang w:val="es-MX"/>
+        </w:rPr>
+        <w:t>DIEGO BARRIONUEVO GARCES</w:t>
+      </w:r>
     </w:p>
     <w:p>
       <w:pPr>
@@ -299,6 +307,18 @@
     <w:p>
       <w:pPr>
         <w:spacing w:after="0" w:line="276" w:lineRule="auto"/>
+        <w:ind w:left="720" w:right="720"/>
+        <w:jc w:val="center"/>
+        <w:rPr>
+          <w:rFonts w:ascii="Times New Roman" w:hAnsi="Times New Roman" w:cs="Times New Roman"/>
+          <w:sz w:val="24"/>
+          <w:lang w:val="es-MX"/>
+        </w:rPr>
+      </w:pPr>
+    </w:p>
+    <w:p>
+      <w:pPr>
+        <w:spacing w:after="0" w:line="276" w:lineRule="auto"/>
         <w:ind w:right="720"/>
         <w:rPr>
           <w:rFonts w:ascii="Times New Roman" w:hAnsi="Times New Roman" w:cs="Times New Roman"/>
@@ -322,20 +342,7 @@
     <w:p>
       <w:pPr>
         <w:spacing w:after="0" w:line="276" w:lineRule="auto"/>
-        <w:ind w:left="720" w:right="720"/>
-        <w:jc w:val="center"/>
-        <w:rPr>
-          <w:rFonts w:ascii="Times New Roman" w:hAnsi="Times New Roman" w:cs="Times New Roman"/>
-          <w:sz w:val="24"/>
-          <w:lang w:val="es-MX"/>
-        </w:rPr>
-      </w:pPr>
-    </w:p>
-    <w:p>
-      <w:pPr>
-        <w:spacing w:after="0" w:line="276" w:lineRule="auto"/>
-        <w:ind w:left="720" w:right="720"/>
-        <w:jc w:val="center"/>
+        <w:ind w:right="720"/>
         <w:rPr>
           <w:rFonts w:ascii="Times New Roman" w:hAnsi="Times New Roman" w:cs="Times New Roman"/>
           <w:sz w:val="24"/>
@@ -3899,7 +3906,6 @@
         </w:rPr>
         <w:t xml:space="preserve">La mayoría de los problemas fueron detectados durante la compilación. A </w:t>
       </w:r>
-      <w:proofErr w:type="gramStart"/>
       <w:r>
         <w:rPr>
           <w:rFonts w:ascii="Times New Roman" w:hAnsi="Times New Roman" w:cs="Times New Roman"/>
@@ -3909,7 +3915,6 @@
         </w:rPr>
         <w:t>continuación</w:t>
       </w:r>
-      <w:proofErr w:type="gramEnd"/>
       <w:r>
         <w:rPr>
           <w:rFonts w:ascii="Times New Roman" w:hAnsi="Times New Roman" w:cs="Times New Roman"/>
@@ -4648,7 +4653,6 @@
         <w:t xml:space="preserve"> en juego.cpp sumaba siempre puntaje += 100 sin considerar cuántas filas se habrían eliminado en ese turno. La corrección consiste en usar el valor de retorno de </w:t>
       </w:r>
       <w:proofErr w:type="spellStart"/>
-      <w:proofErr w:type="gramStart"/>
       <w:r>
         <w:rPr>
           <w:rFonts w:ascii="Times New Roman" w:hAnsi="Times New Roman" w:cs="Times New Roman"/>
@@ -4666,17 +4670,7 @@
           <w:sz w:val="24"/>
           <w:lang w:val="es-MX"/>
         </w:rPr>
-        <w:t>(</w:t>
-      </w:r>
-      <w:proofErr w:type="gramEnd"/>
-      <w:r>
-        <w:rPr>
-          <w:rFonts w:ascii="Times New Roman" w:hAnsi="Times New Roman" w:cs="Times New Roman"/>
-          <w:iCs/>
-          <w:sz w:val="24"/>
-          <w:lang w:val="es-MX"/>
-        </w:rPr>
-        <w:t xml:space="preserve">) que cuenta las filas eliminadas, y calcular puntaje += </w:t>
+        <w:t xml:space="preserve">() que cuenta las filas eliminadas, y calcular puntaje += </w:t>
       </w:r>
       <w:proofErr w:type="spellStart"/>
       <w:r>
@@ -4772,27 +4766,7 @@
           <w:sz w:val="24"/>
           <w:lang w:val="es-MX"/>
         </w:rPr>
-        <w:t xml:space="preserve">Error 7: </w:t>
-      </w:r>
-      <w:proofErr w:type="gramStart"/>
-      <w:r>
-        <w:rPr>
-          <w:rFonts w:ascii="Times New Roman" w:hAnsi="Times New Roman" w:cs="Times New Roman"/>
-          <w:iCs/>
-          <w:sz w:val="24"/>
-          <w:lang w:val="es-MX"/>
-        </w:rPr>
-        <w:t>rand(</w:t>
-      </w:r>
-      <w:proofErr w:type="gramEnd"/>
-      <w:r>
-        <w:rPr>
-          <w:rFonts w:ascii="Times New Roman" w:hAnsi="Times New Roman" w:cs="Times New Roman"/>
-          <w:iCs/>
-          <w:sz w:val="24"/>
-          <w:lang w:val="es-MX"/>
-        </w:rPr>
-        <w:t>) sin semilla</w:t>
+        <w:t>Error 7: rand() sin semilla</w:t>
       </w:r>
     </w:p>
     <w:p>
@@ -4853,30 +4827,9 @@
           <w:sz w:val="24"/>
           <w:lang w:val="es-MX"/>
         </w:rPr>
-        <w:t xml:space="preserve"> usa </w:t>
-      </w:r>
-      <w:proofErr w:type="gramStart"/>
-      <w:r>
-        <w:rPr>
-          <w:rFonts w:ascii="Times New Roman" w:hAnsi="Times New Roman" w:cs="Times New Roman"/>
-          <w:iCs/>
-          <w:sz w:val="24"/>
-          <w:lang w:val="es-MX"/>
-        </w:rPr>
-        <w:t>rand(</w:t>
-      </w:r>
-      <w:proofErr w:type="gramEnd"/>
-      <w:r>
-        <w:rPr>
-          <w:rFonts w:ascii="Times New Roman" w:hAnsi="Times New Roman" w:cs="Times New Roman"/>
-          <w:iCs/>
-          <w:sz w:val="24"/>
-          <w:lang w:val="es-MX"/>
-        </w:rPr>
-        <w:t xml:space="preserve">) para elegir el tipo de pieza aleatoriamente, pero en las versiones iniciales nunca se llamaba a </w:t>
+        <w:t xml:space="preserve"> usa rand() para elegir el tipo de pieza aleatoriamente, pero en las versiones iniciales nunca se llamaba a </w:t>
       </w:r>
       <w:proofErr w:type="spellStart"/>
-      <w:proofErr w:type="gramStart"/>
       <w:r>
         <w:rPr>
           <w:rFonts w:ascii="Times New Roman" w:hAnsi="Times New Roman" w:cs="Times New Roman"/>
@@ -4894,20 +4847,9 @@
           <w:sz w:val="24"/>
           <w:lang w:val="es-MX"/>
         </w:rPr>
-        <w:t>(</w:t>
-      </w:r>
-      <w:proofErr w:type="gramEnd"/>
-      <w:r>
-        <w:rPr>
-          <w:rFonts w:ascii="Times New Roman" w:hAnsi="Times New Roman" w:cs="Times New Roman"/>
-          <w:iCs/>
-          <w:sz w:val="24"/>
-          <w:lang w:val="es-MX"/>
-        </w:rPr>
-        <w:t xml:space="preserve">). Esto causaba que las piezas siempre aparecieran en el mismo orden en cada ejecución. Se agrega </w:t>
+        <w:t xml:space="preserve">(). Esto causaba que las piezas siempre aparecieran en el mismo orden en cada ejecución. Se agrega </w:t>
       </w:r>
       <w:proofErr w:type="spellStart"/>
-      <w:proofErr w:type="gramStart"/>
       <w:r>
         <w:rPr>
           <w:rFonts w:ascii="Times New Roman" w:hAnsi="Times New Roman" w:cs="Times New Roman"/>
@@ -4925,17 +4867,7 @@
           <w:sz w:val="24"/>
           <w:lang w:val="es-MX"/>
         </w:rPr>
-        <w:t>(</w:t>
-      </w:r>
-      <w:proofErr w:type="gramEnd"/>
-      <w:r>
-        <w:rPr>
-          <w:rFonts w:ascii="Times New Roman" w:hAnsi="Times New Roman" w:cs="Times New Roman"/>
-          <w:iCs/>
-          <w:sz w:val="24"/>
-          <w:lang w:val="es-MX"/>
-        </w:rPr>
-        <w:t>(</w:t>
+        <w:t>((</w:t>
       </w:r>
       <w:proofErr w:type="spellStart"/>
       <w:r>
@@ -4958,7 +4890,6 @@
         <w:t xml:space="preserve"> </w:t>
       </w:r>
       <w:proofErr w:type="spellStart"/>
-      <w:proofErr w:type="gramStart"/>
       <w:r>
         <w:rPr>
           <w:rFonts w:ascii="Times New Roman" w:hAnsi="Times New Roman" w:cs="Times New Roman"/>
@@ -4976,17 +4907,7 @@
           <w:sz w:val="24"/>
           <w:lang w:val="es-MX"/>
         </w:rPr>
-        <w:t>)time</w:t>
-      </w:r>
-      <w:proofErr w:type="gramEnd"/>
-      <w:r>
-        <w:rPr>
-          <w:rFonts w:ascii="Times New Roman" w:hAnsi="Times New Roman" w:cs="Times New Roman"/>
-          <w:iCs/>
-          <w:sz w:val="24"/>
-          <w:lang w:val="es-MX"/>
-        </w:rPr>
-        <w:t>(</w:t>
+        <w:t>)time(</w:t>
       </w:r>
       <w:proofErr w:type="spellStart"/>
       <w:r>
@@ -5359,27 +5280,7 @@
           <w:sz w:val="24"/>
           <w:lang w:val="es-MX"/>
         </w:rPr>
-        <w:t xml:space="preserve"> = ancho / 8: Esta fórmula permite que </w:t>
-      </w:r>
-      <w:proofErr w:type="gramStart"/>
-      <w:r>
-        <w:rPr>
-          <w:rFonts w:ascii="Times New Roman" w:hAnsi="Times New Roman" w:cs="Times New Roman"/>
-          <w:iCs/>
-          <w:sz w:val="24"/>
-          <w:lang w:val="es-MX"/>
-        </w:rPr>
-        <w:t>todos los algoritmos escale automáticamente</w:t>
-      </w:r>
-      <w:proofErr w:type="gramEnd"/>
-      <w:r>
-        <w:rPr>
-          <w:rFonts w:ascii="Times New Roman" w:hAnsi="Times New Roman" w:cs="Times New Roman"/>
-          <w:iCs/>
-          <w:sz w:val="24"/>
-          <w:lang w:val="es-MX"/>
-        </w:rPr>
-        <w:t xml:space="preserve"> a cualquier ancho </w:t>
+        <w:t xml:space="preserve"> = ancho / 8: Esta fórmula permite que todos los algoritmos escale automáticamente a cualquier ancho </w:t>
       </w:r>
       <w:r>
         <w:rPr>
@@ -5970,7 +5871,6 @@
         </w:rPr>
         <w:t xml:space="preserve"> valiosas del proyecto. Cuando aparecen errores, </w:t>
       </w:r>
-      <w:proofErr w:type="gramStart"/>
       <w:r>
         <w:rPr>
           <w:rFonts w:ascii="Times New Roman" w:hAnsi="Times New Roman" w:cs="Times New Roman"/>
@@ -5989,7 +5889,6 @@
         </w:rPr>
         <w:t xml:space="preserve"> modularidad</w:t>
       </w:r>
-      <w:proofErr w:type="gramEnd"/>
       <w:r>
         <w:rPr>
           <w:rFonts w:ascii="Times New Roman" w:hAnsi="Times New Roman" w:cs="Times New Roman"/>

</xml_diff>